<commit_message>
Capstone Scope and Methodology
Added scope and methodology to the capstone proposal and also the research pack
</commit_message>
<xml_diff>
--- a/Capstone Project - Pedro.docx
+++ b/Capstone Project - Pedro.docx
@@ -204,6 +204,334 @@
         <w:commentReference w:id="9"/>
       </w:r>
     </w:p>
+    <w:p/>
+    <w:p>
+      <w:pPr>
+        <w:pStyle w:val="Heading1"/>
+      </w:pPr>
+      <w:bookmarkStart w:id="10" w:name="_Toc242029255"/>
+      <w:r>
+        <w:t>Scope</w:t>
+      </w:r>
+      <w:bookmarkEnd w:id="10"/>
+    </w:p>
+    <w:p>
+      <w:pPr>
+        <w:keepNext/>
+      </w:pPr>
+      <w:r>
+        <w:rPr>
+          <w:b/>
+        </w:rPr>
+        <w:t>In scope:</w:t>
+      </w:r>
+    </w:p>
+    <w:p>
+      <w:pPr>
+        <w:pStyle w:val="ListParagraph"/>
+        <w:numPr>
+          <w:ilvl w:val="0"/>
+          <w:numId w:val="2"/>
+        </w:numPr>
+      </w:pPr>
+      <w:commentRangeStart w:id="11"/>
+      <w:r>
+        <w:t>Incident records from the UCI ServiceNow event log (March 2016 to February 2017).</w:t>
+      </w:r>
+      <w:commentRangeEnd w:id="11"/>
+      <w:r>
+        <w:rPr>
+          <w:rStyle w:val="CommentReference"/>
+          <w:sz w:val="22"/>
+          <w:szCs w:val="22"/>
+        </w:rPr>
+        <w:commentReference w:id="11"/>
+      </w:r>
+    </w:p>
+    <w:p>
+      <w:pPr>
+        <w:pStyle w:val="ListParagraph"/>
+        <w:numPr>
+          <w:ilvl w:val="0"/>
+          <w:numId w:val="2"/>
+        </w:numPr>
+      </w:pPr>
+      <w:commentRangeStart w:id="12"/>
+      <w:r>
+        <w:t xml:space="preserve">SLA-breach </w:t>
+      </w:r>
+      <w:commentRangeEnd w:id="12"/>
+      <w:r>
+        <w:rPr>
+          <w:rStyle w:val="CommentReference"/>
+          <w:sz w:val="22"/>
+          <w:szCs w:val="22"/>
+        </w:rPr>
+        <w:commentReference w:id="12"/>
+      </w:r>
+      <w:r>
+        <w:t>prediction (classification) as the core model.</w:t>
+      </w:r>
+    </w:p>
+    <w:p>
+      <w:pPr>
+        <w:pStyle w:val="ListParagraph"/>
+        <w:numPr>
+          <w:ilvl w:val="0"/>
+          <w:numId w:val="2"/>
+        </w:numPr>
+      </w:pPr>
+      <w:commentRangeStart w:id="13"/>
+      <w:r>
+        <w:t>Statistical testing of priority consistency.</w:t>
+      </w:r>
+    </w:p>
+    <w:p>
+      <w:pPr>
+        <w:pStyle w:val="ListParagraph"/>
+        <w:numPr>
+          <w:ilvl w:val="0"/>
+          <w:numId w:val="2"/>
+        </w:numPr>
+      </w:pPr>
+      <w:r>
+        <w:t>Clustering and hotspot analysis by category, subcategory, symptom, location and assignment group.</w:t>
+      </w:r>
+    </w:p>
+    <w:p>
+      <w:pPr>
+        <w:pStyle w:val="ListParagraph"/>
+        <w:numPr>
+          <w:ilvl w:val="0"/>
+          <w:numId w:val="2"/>
+        </w:numPr>
+      </w:pPr>
+      <w:r>
+        <w:t>Trend analysis of incident volumes, a Power BI dashboard and a GitHub repository.</w:t>
+      </w:r>
+    </w:p>
+    <w:p>
+      <w:pPr>
+        <w:keepNext/>
+      </w:pPr>
+      <w:r>
+        <w:rPr>
+          <w:b/>
+        </w:rPr>
+        <w:t>Out of scope:</w:t>
+      </w:r>
+    </w:p>
+    <w:p>
+      <w:pPr>
+        <w:pStyle w:val="ListParagraph"/>
+        <w:numPr>
+          <w:ilvl w:val="0"/>
+          <w:numId w:val="2"/>
+        </w:numPr>
+      </w:pPr>
+      <w:r>
+        <w:t>Employer and other confidential data.</w:t>
+      </w:r>
+    </w:p>
+    <w:p>
+      <w:pPr>
+        <w:pStyle w:val="ListParagraph"/>
+        <w:numPr>
+          <w:ilvl w:val="0"/>
+          <w:numId w:val="2"/>
+        </w:numPr>
+      </w:pPr>
+      <w:r>
+        <w:t>Free-text analysis, as the dataset does not contain incident descriptions.</w:t>
+      </w:r>
+    </w:p>
+    <w:p>
+      <w:pPr>
+        <w:pStyle w:val="ListParagraph"/>
+        <w:numPr>
+          <w:ilvl w:val="0"/>
+          <w:numId w:val="2"/>
+        </w:numPr>
+      </w:pPr>
+      <w:r>
+        <w:t>Real-time integration with ServiceNow, production deployment and regulatory reporting.</w:t>
+      </w:r>
+    </w:p>
+    <w:p>
+      <w:r>
+        <w:rPr>
+          <w:b/>
+        </w:rPr>
+        <w:t>Stretch goal:</w:t>
+      </w:r>
+      <w:r>
+        <w:t xml:space="preserve"> if necessary, the BPI Challenge 2014 dataset will be used to analyse incidents linked to changes and configuration items, which the UCI data records includes on fewer than 1% of incidents.</w:t>
+      </w:r>
+      <w:commentRangeEnd w:id="13"/>
+      <w:r>
+        <w:rPr>
+          <w:rStyle w:val="CommentReference"/>
+          <w:sz w:val="22"/>
+          <w:szCs w:val="22"/>
+        </w:rPr>
+        <w:commentReference w:id="13"/>
+      </w:r>
+    </w:p>
+    <w:p>
+      <w:pPr>
+        <w:pStyle w:val="Heading1"/>
+      </w:pPr>
+      <w:bookmarkStart w:id="14" w:name="_Toc242029256"/>
+      <w:commentRangeStart w:id="15"/>
+      <w:r>
+        <w:t>Methodology</w:t>
+      </w:r>
+      <w:bookmarkEnd w:id="14"/>
+    </w:p>
+    <w:p>
+      <w:r>
+        <w:t>The project will follow CRISP-DM (Cross-Industry Standard Process for Data Mining), which moves through business understanding, data understanding, data preparation, modelling, evaluation and deployment (Chapman et al., 2000). It suits this project because it starts from the business question and allows each phase to be revisited if any issues appear during the development.</w:t>
+      </w:r>
+    </w:p>
+    <w:p>
+      <w:r>
+        <w:rPr>
+          <w:b/>
+        </w:rPr>
+        <w:lastRenderedPageBreak/>
+        <w:t>Data preparation.</w:t>
+      </w:r>
+      <w:r>
+        <w:t xml:space="preserve"> The UCI file is an event log with one row per update. It will be reshaped into one row per incident: information will come from the first event and the target, SLA met or breached, from the last event. Incidents missing important fields will be removed, while gaps in less important fields, such as symptom, will be labelled as “Unknown”.</w:t>
+      </w:r>
+    </w:p>
+    <w:p>
+      <w:pPr>
+        <w:rPr>
+          <w:bCs/>
+        </w:rPr>
+      </w:pPr>
+      <w:r>
+        <w:rPr>
+          <w:b/>
+        </w:rPr>
+        <w:t>Modelling and evaluation.</w:t>
+      </w:r>
+      <w:r>
+        <w:rPr>
+          <w:bCs/>
+        </w:rPr>
+        <w:t xml:space="preserve"> Classification models such as logistic regression, decision trees and random forests will be trained to predict SLA breach and compared with a simple baseline that uses priority alone. Data will be split by time, training on earlier months and testing on later ones, to reflect a real scenario. Models will be evaluated with accuracy, precision, recall and F1. A chi-square test will check whether priority is associated with SLA outcome, and clustering (e.g. k-means) will group similar incidents to identify hotspots.</w:t>
+      </w:r>
+    </w:p>
+    <w:p>
+      <w:r>
+        <w:rPr>
+          <w:b/>
+        </w:rPr>
+        <w:t>Tools.</w:t>
+      </w:r>
+      <w:r>
+        <w:t xml:space="preserve"> Python (pandas, scikit-learn, seaborn) will be used for analysis and modelling, SQLite for storage, Power BI for the dashboard and GitHub for version control. Open-source tools were chosen for modelling because they are free, transparent and reproducible; Power BI is extensively used for reporting in financial services.</w:t>
+      </w:r>
+    </w:p>
+    <w:p>
+      <w:r>
+        <w:rPr>
+          <w:b/>
+        </w:rPr>
+        <w:t>Architecture.</w:t>
+      </w:r>
+      <w:r>
+        <w:t xml:space="preserve"> Figure 1 shows the data flow: source files are loaded into SQLite, prepared in Python and passed to three analytical streams. Results are evaluated and written back as scored tables that feed the dashboard, with governance controls applied throughout.</w:t>
+      </w:r>
+      <w:commentRangeEnd w:id="15"/>
+      <w:r>
+        <w:rPr>
+          <w:rStyle w:val="CommentReference"/>
+          <w:sz w:val="22"/>
+          <w:szCs w:val="22"/>
+        </w:rPr>
+        <w:commentReference w:id="15"/>
+      </w:r>
+    </w:p>
+    <w:p>
+      <w:pPr>
+        <w:keepNext/>
+        <w:jc w:val="center"/>
+      </w:pPr>
+      <w:commentRangeStart w:id="16"/>
+      <w:r>
+        <w:rPr>
+          <w:noProof/>
+        </w:rPr>
+        <w:drawing>
+          <wp:inline distT="0" distB="0" distL="0" distR="0" wp14:anchorId="65918E7C" wp14:editId="1C14197E">
+            <wp:extent cx="5714998" cy="2872391"/>
+            <wp:effectExtent l="0" t="0" r="635" b="4445"/>
+            <wp:docPr id="1728545884" name="Picture 1728545884"/>
+            <wp:cNvGraphicFramePr>
+              <a:graphicFrameLocks xmlns:a="http://schemas.openxmlformats.org/drawingml/2006/main" noChangeAspect="1"/>
+            </wp:cNvGraphicFramePr>
+            <a:graphic xmlns:a="http://schemas.openxmlformats.org/drawingml/2006/main">
+              <a:graphicData uri="http://schemas.openxmlformats.org/drawingml/2006/picture">
+                <pic:pic xmlns:pic="http://schemas.openxmlformats.org/drawingml/2006/picture">
+                  <pic:nvPicPr>
+                    <pic:cNvPr id="1728545884" name="Picture 1728545884"/>
+                    <pic:cNvPicPr/>
+                  </pic:nvPicPr>
+                  <pic:blipFill>
+                    <a:blip r:embed="rId9" cstate="print">
+                      <a:extLst>
+                        <a:ext uri="{28A0092B-C50C-407E-A947-70E740481C1C}">
+                          <a14:useLocalDpi xmlns:a14="http://schemas.microsoft.com/office/drawing/2010/main" val="0"/>
+                        </a:ext>
+                      </a:extLst>
+                    </a:blip>
+                    <a:stretch>
+                      <a:fillRect/>
+                    </a:stretch>
+                  </pic:blipFill>
+                  <pic:spPr>
+                    <a:xfrm>
+                      <a:off x="0" y="0"/>
+                      <a:ext cx="5714998" cy="2872391"/>
+                    </a:xfrm>
+                    <a:prstGeom prst="rect">
+                      <a:avLst/>
+                    </a:prstGeom>
+                  </pic:spPr>
+                </pic:pic>
+              </a:graphicData>
+            </a:graphic>
+          </wp:inline>
+        </w:drawing>
+      </w:r>
+      <w:commentRangeEnd w:id="16"/>
+      <w:r>
+        <w:rPr>
+          <w:rStyle w:val="CommentReference"/>
+          <w:sz w:val="22"/>
+          <w:szCs w:val="22"/>
+        </w:rPr>
+        <w:commentReference w:id="16"/>
+      </w:r>
+    </w:p>
+    <w:p>
+      <w:pPr>
+        <w:spacing w:before="120"/>
+        <w:jc w:val="center"/>
+      </w:pPr>
+      <w:r>
+        <w:rPr>
+          <w:i/>
+          <w:color w:val="404040"/>
+          <w:sz w:val="18"/>
+        </w:rPr>
+        <w:t>Figure 1. High-level architecture of the proposed solution.</w:t>
+      </w:r>
+    </w:p>
+    <w:p/>
     <w:p/>
     <w:p/>
     <w:p/>
@@ -331,6 +659,86 @@
       </w:r>
     </w:p>
   </w:comment>
+  <w:comment w:id="11" w:author="Pedro Guerra" w:date="2026-10-04T18:55:00Z" w:initials="PG">
+    <w:p>
+      <w:pPr>
+        <w:pStyle w:val="CommentText"/>
+      </w:pPr>
+      <w:r>
+        <w:rPr>
+          <w:rStyle w:val="CommentReference"/>
+        </w:rPr>
+        <w:annotationRef/>
+      </w:r>
+      <w:r>
+        <w:t>Reviewed</w:t>
+      </w:r>
+    </w:p>
+  </w:comment>
+  <w:comment w:id="12" w:author="Pedro Guerra" w:date="2026-10-04T18:55:00Z" w:initials="PG">
+    <w:p>
+      <w:pPr>
+        <w:pStyle w:val="CommentText"/>
+      </w:pPr>
+      <w:r>
+        <w:rPr>
+          <w:rStyle w:val="CommentReference"/>
+        </w:rPr>
+        <w:annotationRef/>
+      </w:r>
+      <w:r>
+        <w:t xml:space="preserve">Where is this? </w:t>
+      </w:r>
+    </w:p>
+  </w:comment>
+  <w:comment w:id="13" w:author="Pedro Guerra" w:date="2026-10-04T18:58:00Z" w:initials="PG">
+    <w:p>
+      <w:pPr>
+        <w:pStyle w:val="CommentText"/>
+      </w:pPr>
+      <w:r>
+        <w:rPr>
+          <w:rStyle w:val="CommentReference"/>
+        </w:rPr>
+        <w:annotationRef/>
+      </w:r>
+      <w:r>
+        <w:t>Reviewed</w:t>
+      </w:r>
+    </w:p>
+  </w:comment>
+  <w:comment w:id="15" w:author="Pedro Guerra" w:date="2026-10-05T21:48:00Z" w:initials="PG">
+    <w:p>
+      <w:pPr>
+        <w:pStyle w:val="CommentText"/>
+      </w:pPr>
+      <w:r>
+        <w:rPr>
+          <w:rStyle w:val="CommentReference"/>
+        </w:rPr>
+        <w:annotationRef/>
+      </w:r>
+      <w:r>
+        <w:t>Reviewed</w:t>
+      </w:r>
+    </w:p>
+  </w:comment>
+  <w:comment w:id="16" w:author="Pedro Guerra" w:date="2026-10-07T22:06:00Z" w:initials="PG">
+    <w:p>
+      <w:pPr>
+        <w:pStyle w:val="CommentText"/>
+      </w:pPr>
+      <w:r>
+        <w:rPr>
+          <w:rStyle w:val="CommentReference"/>
+        </w:rPr>
+        <w:annotationRef/>
+      </w:r>
+      <w:r>
+        <w:t>Reviewed</w:t>
+      </w:r>
+    </w:p>
+  </w:comment>
 </w:comments>
 </file>
 
@@ -343,6 +751,11 @@
   <w15:commentEx w15:paraId="513DCA0F" w15:done="0"/>
   <w15:commentEx w15:paraId="4A7D8BC6" w15:done="0"/>
   <w15:commentEx w15:paraId="4D67FB1A" w15:done="0"/>
+  <w15:commentEx w15:paraId="4A22C692" w15:done="0"/>
+  <w15:commentEx w15:paraId="3328BA0A" w15:done="0"/>
+  <w15:commentEx w15:paraId="3C75D3CC" w15:done="0"/>
+  <w15:commentEx w15:paraId="0F4AFB80" w15:done="0"/>
+  <w15:commentEx w15:paraId="4A9F0E6E" w15:done="0"/>
 </w15:commentsEx>
 </file>
 
@@ -355,6 +768,11 @@
   <w16cex:commentExtensible w16cex:durableId="634A5D87" w16cex:dateUtc="2026-10-07T20:51:00Z"/>
   <w16cex:commentExtensible w16cex:durableId="4EBAC678" w16cex:dateUtc="2026-10-07T20:51:00Z"/>
   <w16cex:commentExtensible w16cex:durableId="68D5825E" w16cex:dateUtc="2026-10-07T20:51:00Z"/>
+  <w16cex:commentExtensible w16cex:durableId="7D4F119E" w16cex:dateUtc="2026-10-04T17:55:00Z"/>
+  <w16cex:commentExtensible w16cex:durableId="7DA0FB7D" w16cex:dateUtc="2026-10-04T17:55:00Z"/>
+  <w16cex:commentExtensible w16cex:durableId="61A89EA2" w16cex:dateUtc="2026-10-04T17:58:00Z"/>
+  <w16cex:commentExtensible w16cex:durableId="2FB6D24E" w16cex:dateUtc="2026-10-05T20:48:00Z"/>
+  <w16cex:commentExtensible w16cex:durableId="38CC18E4" w16cex:dateUtc="2026-10-07T21:06:00Z"/>
 </w16cex:commentsExtensible>
 </file>
 
@@ -367,12 +785,34 @@
   <w16cid:commentId w16cid:paraId="513DCA0F" w16cid:durableId="634A5D87"/>
   <w16cid:commentId w16cid:paraId="4A7D8BC6" w16cid:durableId="4EBAC678"/>
   <w16cid:commentId w16cid:paraId="4D67FB1A" w16cid:durableId="68D5825E"/>
+  <w16cid:commentId w16cid:paraId="4A22C692" w16cid:durableId="7D4F119E"/>
+  <w16cid:commentId w16cid:paraId="3328BA0A" w16cid:durableId="7DA0FB7D"/>
+  <w16cid:commentId w16cid:paraId="3C75D3CC" w16cid:durableId="61A89EA2"/>
+  <w16cid:commentId w16cid:paraId="0F4AFB80" w16cid:durableId="2FB6D24E"/>
+  <w16cid:commentId w16cid:paraId="4A9F0E6E" w16cid:durableId="38CC18E4"/>
 </w16cid:commentsIds>
 </file>
 
 <file path=word/numbering.xml><?xml version="1.0" encoding="utf-8"?>
 <w:numbering xmlns:wpc="http://schemas.microsoft.com/office/word/2010/wordprocessingCanvas" xmlns:cx="http://schemas.microsoft.com/office/drawing/2014/chartex" xmlns:cx1="http://schemas.microsoft.com/office/drawing/2015/9/8/chartex" xmlns:cx2="http://schemas.microsoft.com/office/drawing/2015/10/21/chartex" xmlns:cx3="http://schemas.microsoft.com/office/drawing/2016/5/9/chartex" xmlns:cx4="http://schemas.microsoft.com/office/drawing/2016/5/10/chartex" xmlns:cx5="http://schemas.microsoft.com/office/drawing/2016/5/11/chartex" xmlns:cx6="http://schemas.microsoft.com/office/drawing/2016/5/12/chartex" xmlns:cx7="http://schemas.microsoft.com/office/drawing/2016/5/13/chartex" xmlns:cx8="http://schemas.microsoft.com/office/drawing/2016/5/14/chartex" xmlns:mc="http://schemas.openxmlformats.org/markup-compatibility/2006" xmlns:aink="http://schemas.microsoft.com/office/drawing/2016/ink" xmlns:am3d="http://schemas.microsoft.com/office/drawing/2017/model3d" xmlns:o="urn:schemas-microsoft-com:office:office" xmlns:oel="http://schemas.microsoft.com/office/2019/extlst" xmlns:r="http://schemas.openxmlformats.org/officeDocument/2006/relationships" xmlns:m="http://schemas.openxmlformats.org/officeDocument/2006/math" xmlns:v="urn:schemas-microsoft-com:vml" xmlns:wp14="http://schemas.microsoft.com/office/word/2010/wordprocessingDrawing" xmlns:wp="http://schemas.openxmlformats.org/drawingml/2006/wordprocessingDrawing" xmlns:w10="urn:schemas-microsoft-com:office:word" xmlns:w="http://schemas.openxmlformats.org/wordprocessingml/2006/main" xmlns:w14="http://schemas.microsoft.com/office/word/2010/wordml" xmlns:w15="http://schemas.microsoft.com/office/word/2012/wordml" xmlns:w16cex="http://schemas.microsoft.com/office/word/2018/wordml/cex" xmlns:w16cid="http://schemas.microsoft.com/office/word/2016/wordml/cid" xmlns:w16="http://schemas.microsoft.com/office/word/2018/wordml" xmlns:w16du="http://schemas.microsoft.com/office/word/2023/wordml/word16du" xmlns:w16sdtdh="http://schemas.microsoft.com/office/word/2020/wordml/sdtdatahash" xmlns:w16sdtfl="http://schemas.microsoft.com/office/word/2024/wordml/sdtformatlock" xmlns:w16se="http://schemas.microsoft.com/office/word/2015/wordml/symex" xmlns:wpg="http://schemas.microsoft.com/office/word/2010/wordprocessingGroup" xmlns:wpi="http://schemas.microsoft.com/office/word/2010/wordprocessingInk" xmlns:wne="http://schemas.microsoft.com/office/word/2006/wordml" xmlns:wps="http://schemas.microsoft.com/office/word/2010/wordprocessingShape" mc:Ignorable="w14 w15 w16se w16cid w16 w16cex w16sdtdh w16sdtfl w16du wp14">
   <w:abstractNum w:abstractNumId="0" w15:restartNumberingAfterBreak="0">
+    <w:nsid w:val="0AF50552"/>
+    <w:multiLevelType w:val="singleLevel"/>
+    <w:tmpl w:val="953EF086"/>
+    <w:lvl w:ilvl="0">
+      <w:start w:val="1"/>
+      <w:numFmt w:val="bullet"/>
+      <w:lvlText w:val="•"/>
+      <w:lvlJc w:val="left"/>
+      <w:pPr>
+        <w:ind w:left="720" w:hanging="360"/>
+      </w:pPr>
+      <w:rPr>
+        <w:rFonts w:ascii="Calibri" w:hAnsi="Calibri"/>
+      </w:rPr>
+    </w:lvl>
+  </w:abstractNum>
+  <w:abstractNum w:abstractNumId="1" w15:restartNumberingAfterBreak="0">
     <w:nsid w:val="72E51977"/>
     <w:multiLevelType w:val="singleLevel"/>
     <w:tmpl w:val="1809000F"/>
@@ -387,10 +827,13 @@
     </w:lvl>
   </w:abstractNum>
   <w:num w:numId="1" w16cid:durableId="116070062">
-    <w:abstractNumId w:val="0"/>
+    <w:abstractNumId w:val="1"/>
     <w:lvlOverride w:ilvl="0">
       <w:startOverride w:val="1"/>
     </w:lvlOverride>
+  </w:num>
+  <w:num w:numId="2" w16cid:durableId="1752652010">
+    <w:abstractNumId w:val="0"/>
   </w:num>
 </w:numbering>
 </file>
@@ -1005,6 +1448,7 @@
   <w:style w:type="character" w:default="1" w:styleId="DefaultParagraphFont">
     <w:name w:val="Default Paragraph Font"/>
     <w:uiPriority w:val="1"/>
+    <w:semiHidden/>
     <w:unhideWhenUsed/>
   </w:style>
   <w:style w:type="table" w:default="1" w:styleId="TableNormal">
@@ -1323,7 +1767,6 @@
     <w:basedOn w:val="Normal"/>
     <w:link w:val="CommentTextChar"/>
     <w:uiPriority w:val="99"/>
-    <w:semiHidden/>
     <w:unhideWhenUsed/>
     <w:rsid w:val="0096623F"/>
     <w:pPr>
@@ -1342,7 +1785,6 @@
     <w:basedOn w:val="DefaultParagraphFont"/>
     <w:link w:val="CommentText"/>
     <w:uiPriority w:val="99"/>
-    <w:semiHidden/>
     <w:rsid w:val="0096623F"/>
     <w:rPr>
       <w:rFonts w:ascii="Calibri" w:eastAsia="Calibri" w:hAnsi="Calibri" w:cs="Calibri"/>

</xml_diff>

<commit_message>
Update Capstone Project - Pedro.docx
Added Data Sources
</commit_message>
<xml_diff>
--- a/Capstone Project - Pedro.docx
+++ b/Capstone Project - Pedro.docx
@@ -531,8 +531,1684 @@
         <w:t>Figure 1. High-level architecture of the proposed solution.</w:t>
       </w:r>
     </w:p>
-    <w:p/>
-    <w:p/>
+    <w:p>
+      <w:pPr>
+        <w:pStyle w:val="Heading1"/>
+      </w:pPr>
+      <w:bookmarkStart w:id="17" w:name="_Toc242617458"/>
+      <w:r>
+        <w:t>Data Sources</w:t>
+      </w:r>
+      <w:bookmarkEnd w:id="17"/>
+    </w:p>
+    <w:p>
+      <w:r>
+        <w:rPr>
+          <w:b/>
+        </w:rPr>
+        <w:t>Primary dataset.</w:t>
+      </w:r>
+      <w:r>
+        <w:t xml:space="preserve"> The Incident Management Process Enriched Event Log (Amaral, Fantinato and Peres, 2018), from the UCI Machine Learning Repository, was extracted from a ServiceNow instance used by an IT company. It contains 141,712 events describing 24,918 incidents across 36 attributes, including impact, urgency, priority, category, location, assignment group, reassignment count and SLA outcome. First checks confirmed its suitability: Around 24,000 incidents remain </w:t>
+      </w:r>
+      <w:r>
+        <w:lastRenderedPageBreak/>
+        <w:t xml:space="preserve">after cleaning, above the 20,000-record minimum. 36.6% of all real incidents breached their SLA, giving a reasonably balanced target; and 95% were recorded as P3, which supports the priority analysis. </w:t>
+      </w:r>
+    </w:p>
+    <w:p>
+      <w:r>
+        <w:rPr>
+          <w:b/>
+        </w:rPr>
+        <w:t>Backup dataset.</w:t>
+      </w:r>
+      <w:r>
+        <w:t xml:space="preserve"> The BPI Challenge 2014 dataset (van Dongen, 2014), from Rabobank Group ICT, contains around 46,000 incidents linked to interactions, changes and configuration items. It will be used as an alternative if the primary dataset if insufficient for the final analysis. As it comes from a different source, it will be analysed separately rather than merged. </w:t>
+      </w:r>
+    </w:p>
+    <w:p>
+      <w:r>
+        <w:rPr>
+          <w:b/>
+        </w:rPr>
+        <w:t>Permission to use.</w:t>
+      </w:r>
+      <w:r>
+        <w:t xml:space="preserve"> The UCI dataset is licensed under Creative Commons Attribution 4.0 (CC BY 4.0), which permits sharing and adaptation for any purpose with appropriate credit. </w:t>
+      </w:r>
+      <w:r>
+        <w:t>The BPI Challenge 2014 data is openly published on 4TU.ResearchData under the 4TU General Terms of Use, and will be cited using the citation the repository provides.</w:t>
+      </w:r>
+      <w:r>
+        <w:t xml:space="preserve"> Both licences will be recorded in the GitHub repository.</w:t>
+      </w:r>
+    </w:p>
+    <w:p>
+      <w:pPr>
+        <w:pStyle w:val="Heading1"/>
+      </w:pPr>
+      <w:bookmarkStart w:id="18" w:name="_Toc242617459"/>
+      <w:r>
+        <w:t>Expected Deliverables</w:t>
+      </w:r>
+      <w:bookmarkEnd w:id="18"/>
+    </w:p>
+    <w:p>
+      <w:pPr>
+        <w:keepNext/>
+      </w:pPr>
+      <w:r>
+        <w:t>By the end of Semester 2, the project will deliver:</w:t>
+      </w:r>
+    </w:p>
+    <w:p>
+      <w:pPr>
+        <w:pStyle w:val="ListParagraph"/>
+        <w:numPr>
+          <w:ilvl w:val="0"/>
+          <w:numId w:val="3"/>
+        </w:numPr>
+      </w:pPr>
+      <w:r>
+        <w:t>Clean and documented dataset with a data dictionary.</w:t>
+      </w:r>
+    </w:p>
+    <w:p>
+      <w:pPr>
+        <w:pStyle w:val="ListParagraph"/>
+        <w:numPr>
+          <w:ilvl w:val="0"/>
+          <w:numId w:val="3"/>
+        </w:numPr>
+      </w:pPr>
+      <w:r>
+        <w:t>Python notebooks covering the explanation of every analysis, statistical tests and modelling.</w:t>
+      </w:r>
+    </w:p>
+    <w:p>
+      <w:pPr>
+        <w:pStyle w:val="ListParagraph"/>
+        <w:numPr>
+          <w:ilvl w:val="0"/>
+          <w:numId w:val="3"/>
+        </w:numPr>
+      </w:pPr>
+      <w:r>
+        <w:t>Trained SLA-breach model with evaluation report.</w:t>
+      </w:r>
+    </w:p>
+    <w:p>
+      <w:pPr>
+        <w:pStyle w:val="ListParagraph"/>
+        <w:numPr>
+          <w:ilvl w:val="0"/>
+          <w:numId w:val="3"/>
+        </w:numPr>
+      </w:pPr>
+      <w:r>
+        <w:t>Analysis of most affected categories, locations and support groups.</w:t>
+      </w:r>
+    </w:p>
+    <w:p>
+      <w:pPr>
+        <w:pStyle w:val="ListParagraph"/>
+        <w:numPr>
+          <w:ilvl w:val="0"/>
+          <w:numId w:val="3"/>
+        </w:numPr>
+      </w:pPr>
+      <w:r>
+        <w:t>Interactive Power BI dashboard for leadership decisioning.</w:t>
+      </w:r>
+    </w:p>
+    <w:p>
+      <w:pPr>
+        <w:pStyle w:val="ListParagraph"/>
+        <w:numPr>
+          <w:ilvl w:val="0"/>
+          <w:numId w:val="3"/>
+        </w:numPr>
+      </w:pPr>
+      <w:r>
+        <w:t>A final report and presentation, with all code in a GitHub repository.</w:t>
+      </w:r>
+    </w:p>
+    <w:p>
+      <w:pPr>
+        <w:pStyle w:val="Heading1"/>
+      </w:pPr>
+      <w:bookmarkStart w:id="19" w:name="_Toc242617460"/>
+      <w:r>
+        <w:t>Project Timeline</w:t>
+      </w:r>
+      <w:bookmarkEnd w:id="19"/>
+    </w:p>
+    <w:p>
+      <w:r>
+        <w:t>The timeline shows the phases across two semesters (Figure 2). Semester 1 covers business understanding and data preparation; Semester 2 covers development, evaluation and delivery. Five milestones track progress: M1 capstone proposal submitted (25 October 2026); M2 clean dataset and analysis (end of Semester 1); M3 statistical development (Semester 2, week 3); M4 final models and clustering (Semester 2, week 9); and M5 dashboard and final presentation (end of Semester 2).</w:t>
+      </w:r>
+    </w:p>
+    <w:tbl>
+      <w:tblPr>
+        <w:tblStyle w:val="TableGrid"/>
+        <w:tblW w:w="9026" w:type="dxa"/>
+        <w:jc w:val="center"/>
+        <w:tblLayout w:type="fixed"/>
+        <w:tblLook w:val="04A0" w:firstRow="1" w:lastRow="0" w:firstColumn="1" w:lastColumn="0" w:noHBand="0" w:noVBand="1"/>
+      </w:tblPr>
+      <w:tblGrid>
+        <w:gridCol w:w="3026"/>
+        <w:gridCol w:w="750"/>
+        <w:gridCol w:w="750"/>
+        <w:gridCol w:w="750"/>
+        <w:gridCol w:w="750"/>
+        <w:gridCol w:w="750"/>
+        <w:gridCol w:w="750"/>
+        <w:gridCol w:w="750"/>
+        <w:gridCol w:w="750"/>
+      </w:tblGrid>
+      <w:tr>
+        <w:trPr>
+          <w:cantSplit/>
+          <w:tblHeader/>
+          <w:jc w:val="center"/>
+        </w:trPr>
+        <w:tc>
+          <w:tcPr>
+            <w:tcW w:w="3026" w:type="dxa"/>
+            <w:vMerge w:val="restart"/>
+            <w:shd w:val="clear" w:color="auto" w:fill="3A3A3A"/>
+            <w:vAlign w:val="center"/>
+          </w:tcPr>
+          <w:p>
+            <w:r>
+              <w:rPr>
+                <w:b/>
+                <w:color w:val="FFFFFF"/>
+                <w:sz w:val="18"/>
+              </w:rPr>
+              <w:t>Phase / task</w:t>
+            </w:r>
+          </w:p>
+        </w:tc>
+        <w:tc>
+          <w:tcPr>
+            <w:tcW w:w="3000" w:type="dxa"/>
+            <w:gridSpan w:val="4"/>
+            <w:shd w:val="clear" w:color="auto" w:fill="3A3A3A"/>
+            <w:vAlign w:val="center"/>
+          </w:tcPr>
+          <w:p>
+            <w:pPr>
+              <w:jc w:val="center"/>
+            </w:pPr>
+            <w:r>
+              <w:rPr>
+                <w:b/>
+                <w:color w:val="FFFFFF"/>
+                <w:sz w:val="18"/>
+              </w:rPr>
+              <w:t>Semester 1 (2026)</w:t>
+            </w:r>
+          </w:p>
+        </w:tc>
+        <w:tc>
+          <w:tcPr>
+            <w:tcW w:w="3000" w:type="dxa"/>
+            <w:gridSpan w:val="4"/>
+            <w:shd w:val="clear" w:color="auto" w:fill="3A3A3A"/>
+            <w:vAlign w:val="center"/>
+          </w:tcPr>
+          <w:p>
+            <w:pPr>
+              <w:jc w:val="center"/>
+            </w:pPr>
+            <w:r>
+              <w:rPr>
+                <w:b/>
+                <w:color w:val="FFFFFF"/>
+                <w:sz w:val="18"/>
+              </w:rPr>
+              <w:t>Semester 2 (2027)</w:t>
+            </w:r>
+          </w:p>
+        </w:tc>
+      </w:tr>
+      <w:tr>
+        <w:trPr>
+          <w:cantSplit/>
+          <w:tblHeader/>
+          <w:jc w:val="center"/>
+        </w:trPr>
+        <w:tc>
+          <w:tcPr>
+            <w:tcW w:w="3026" w:type="dxa"/>
+            <w:vMerge/>
+            <w:vAlign w:val="center"/>
+          </w:tcPr>
+          <w:p/>
+        </w:tc>
+        <w:tc>
+          <w:tcPr>
+            <w:tcW w:w="750" w:type="dxa"/>
+            <w:shd w:val="clear" w:color="auto" w:fill="D9D9D9"/>
+            <w:vAlign w:val="center"/>
+          </w:tcPr>
+          <w:p>
+            <w:pPr>
+              <w:jc w:val="center"/>
+            </w:pPr>
+            <w:r>
+              <w:rPr>
+                <w:b/>
+                <w:sz w:val="16"/>
+              </w:rPr>
+              <w:t>W1–3</w:t>
+            </w:r>
+          </w:p>
+        </w:tc>
+        <w:tc>
+          <w:tcPr>
+            <w:tcW w:w="750" w:type="dxa"/>
+            <w:shd w:val="clear" w:color="auto" w:fill="D9D9D9"/>
+            <w:vAlign w:val="center"/>
+          </w:tcPr>
+          <w:p>
+            <w:pPr>
+              <w:jc w:val="center"/>
+            </w:pPr>
+            <w:r>
+              <w:rPr>
+                <w:b/>
+                <w:sz w:val="16"/>
+              </w:rPr>
+              <w:t>W4–6</w:t>
+            </w:r>
+          </w:p>
+        </w:tc>
+        <w:tc>
+          <w:tcPr>
+            <w:tcW w:w="750" w:type="dxa"/>
+            <w:shd w:val="clear" w:color="auto" w:fill="D9D9D9"/>
+            <w:vAlign w:val="center"/>
+          </w:tcPr>
+          <w:p>
+            <w:pPr>
+              <w:jc w:val="center"/>
+            </w:pPr>
+            <w:r>
+              <w:rPr>
+                <w:b/>
+                <w:sz w:val="16"/>
+              </w:rPr>
+              <w:t>W7–9</w:t>
+            </w:r>
+          </w:p>
+        </w:tc>
+        <w:tc>
+          <w:tcPr>
+            <w:tcW w:w="750" w:type="dxa"/>
+            <w:shd w:val="clear" w:color="auto" w:fill="D9D9D9"/>
+            <w:vAlign w:val="center"/>
+          </w:tcPr>
+          <w:p>
+            <w:pPr>
+              <w:jc w:val="center"/>
+            </w:pPr>
+            <w:r>
+              <w:rPr>
+                <w:b/>
+                <w:sz w:val="16"/>
+              </w:rPr>
+              <w:t>W10–12</w:t>
+            </w:r>
+          </w:p>
+        </w:tc>
+        <w:tc>
+          <w:tcPr>
+            <w:tcW w:w="750" w:type="dxa"/>
+            <w:shd w:val="clear" w:color="auto" w:fill="D9D9D9"/>
+            <w:vAlign w:val="center"/>
+          </w:tcPr>
+          <w:p>
+            <w:pPr>
+              <w:jc w:val="center"/>
+            </w:pPr>
+            <w:r>
+              <w:rPr>
+                <w:b/>
+                <w:sz w:val="16"/>
+              </w:rPr>
+              <w:t>W1–3</w:t>
+            </w:r>
+          </w:p>
+        </w:tc>
+        <w:tc>
+          <w:tcPr>
+            <w:tcW w:w="750" w:type="dxa"/>
+            <w:shd w:val="clear" w:color="auto" w:fill="D9D9D9"/>
+            <w:vAlign w:val="center"/>
+          </w:tcPr>
+          <w:p>
+            <w:pPr>
+              <w:jc w:val="center"/>
+            </w:pPr>
+            <w:r>
+              <w:rPr>
+                <w:b/>
+                <w:sz w:val="16"/>
+              </w:rPr>
+              <w:t>W4–6</w:t>
+            </w:r>
+          </w:p>
+        </w:tc>
+        <w:tc>
+          <w:tcPr>
+            <w:tcW w:w="750" w:type="dxa"/>
+            <w:shd w:val="clear" w:color="auto" w:fill="D9D9D9"/>
+            <w:vAlign w:val="center"/>
+          </w:tcPr>
+          <w:p>
+            <w:pPr>
+              <w:jc w:val="center"/>
+            </w:pPr>
+            <w:r>
+              <w:rPr>
+                <w:b/>
+                <w:sz w:val="16"/>
+              </w:rPr>
+              <w:t>W7–9</w:t>
+            </w:r>
+          </w:p>
+        </w:tc>
+        <w:tc>
+          <w:tcPr>
+            <w:tcW w:w="750" w:type="dxa"/>
+            <w:shd w:val="clear" w:color="auto" w:fill="D9D9D9"/>
+            <w:vAlign w:val="center"/>
+          </w:tcPr>
+          <w:p>
+            <w:pPr>
+              <w:jc w:val="center"/>
+            </w:pPr>
+            <w:r>
+              <w:rPr>
+                <w:b/>
+                <w:sz w:val="16"/>
+              </w:rPr>
+              <w:t>W10–12</w:t>
+            </w:r>
+          </w:p>
+        </w:tc>
+      </w:tr>
+      <w:tr>
+        <w:trPr>
+          <w:cantSplit/>
+          <w:jc w:val="center"/>
+        </w:trPr>
+        <w:tc>
+          <w:tcPr>
+            <w:tcW w:w="3026" w:type="dxa"/>
+            <w:vAlign w:val="center"/>
+          </w:tcPr>
+          <w:p>
+            <w:r>
+              <w:rPr>
+                <w:sz w:val="17"/>
+              </w:rPr>
+              <w:t>Business understanding and proposal</w:t>
+            </w:r>
+          </w:p>
+        </w:tc>
+        <w:tc>
+          <w:tcPr>
+            <w:tcW w:w="750" w:type="dxa"/>
+            <w:shd w:val="clear" w:color="auto" w:fill="1F4E79"/>
+            <w:vAlign w:val="center"/>
+          </w:tcPr>
+          <w:p/>
+        </w:tc>
+        <w:tc>
+          <w:tcPr>
+            <w:tcW w:w="750" w:type="dxa"/>
+            <w:shd w:val="clear" w:color="auto" w:fill="1F4E79"/>
+            <w:vAlign w:val="center"/>
+          </w:tcPr>
+          <w:p/>
+        </w:tc>
+        <w:tc>
+          <w:tcPr>
+            <w:tcW w:w="750" w:type="dxa"/>
+            <w:vAlign w:val="center"/>
+          </w:tcPr>
+          <w:p/>
+        </w:tc>
+        <w:tc>
+          <w:tcPr>
+            <w:tcW w:w="750" w:type="dxa"/>
+            <w:vAlign w:val="center"/>
+          </w:tcPr>
+          <w:p/>
+        </w:tc>
+        <w:tc>
+          <w:tcPr>
+            <w:tcW w:w="750" w:type="dxa"/>
+            <w:vAlign w:val="center"/>
+          </w:tcPr>
+          <w:p/>
+        </w:tc>
+        <w:tc>
+          <w:tcPr>
+            <w:tcW w:w="750" w:type="dxa"/>
+            <w:vAlign w:val="center"/>
+          </w:tcPr>
+          <w:p/>
+        </w:tc>
+        <w:tc>
+          <w:tcPr>
+            <w:tcW w:w="750" w:type="dxa"/>
+            <w:vAlign w:val="center"/>
+          </w:tcPr>
+          <w:p/>
+        </w:tc>
+        <w:tc>
+          <w:tcPr>
+            <w:tcW w:w="750" w:type="dxa"/>
+            <w:vAlign w:val="center"/>
+          </w:tcPr>
+          <w:p/>
+        </w:tc>
+      </w:tr>
+      <w:tr>
+        <w:trPr>
+          <w:cantSplit/>
+          <w:jc w:val="center"/>
+        </w:trPr>
+        <w:tc>
+          <w:tcPr>
+            <w:tcW w:w="3026" w:type="dxa"/>
+            <w:vAlign w:val="center"/>
+          </w:tcPr>
+          <w:p>
+            <w:r>
+              <w:rPr>
+                <w:sz w:val="17"/>
+              </w:rPr>
+              <w:t>Document Review</w:t>
+            </w:r>
+          </w:p>
+        </w:tc>
+        <w:tc>
+          <w:tcPr>
+            <w:tcW w:w="750" w:type="dxa"/>
+            <w:vAlign w:val="center"/>
+          </w:tcPr>
+          <w:p/>
+        </w:tc>
+        <w:tc>
+          <w:tcPr>
+            <w:tcW w:w="750" w:type="dxa"/>
+            <w:shd w:val="clear" w:color="auto" w:fill="1F4E79"/>
+            <w:vAlign w:val="center"/>
+          </w:tcPr>
+          <w:p/>
+        </w:tc>
+        <w:tc>
+          <w:tcPr>
+            <w:tcW w:w="750" w:type="dxa"/>
+            <w:shd w:val="clear" w:color="auto" w:fill="1F4E79"/>
+            <w:vAlign w:val="center"/>
+          </w:tcPr>
+          <w:p/>
+        </w:tc>
+        <w:tc>
+          <w:tcPr>
+            <w:tcW w:w="750" w:type="dxa"/>
+            <w:vAlign w:val="center"/>
+          </w:tcPr>
+          <w:p/>
+        </w:tc>
+        <w:tc>
+          <w:tcPr>
+            <w:tcW w:w="750" w:type="dxa"/>
+            <w:vAlign w:val="center"/>
+          </w:tcPr>
+          <w:p/>
+        </w:tc>
+        <w:tc>
+          <w:tcPr>
+            <w:tcW w:w="750" w:type="dxa"/>
+            <w:vAlign w:val="center"/>
+          </w:tcPr>
+          <w:p/>
+        </w:tc>
+        <w:tc>
+          <w:tcPr>
+            <w:tcW w:w="750" w:type="dxa"/>
+            <w:vAlign w:val="center"/>
+          </w:tcPr>
+          <w:p/>
+        </w:tc>
+        <w:tc>
+          <w:tcPr>
+            <w:tcW w:w="750" w:type="dxa"/>
+            <w:vAlign w:val="center"/>
+          </w:tcPr>
+          <w:p/>
+        </w:tc>
+      </w:tr>
+      <w:tr>
+        <w:trPr>
+          <w:cantSplit/>
+          <w:jc w:val="center"/>
+        </w:trPr>
+        <w:tc>
+          <w:tcPr>
+            <w:tcW w:w="3026" w:type="dxa"/>
+            <w:vAlign w:val="center"/>
+          </w:tcPr>
+          <w:p>
+            <w:r>
+              <w:rPr>
+                <w:sz w:val="17"/>
+              </w:rPr>
+              <w:t xml:space="preserve">Data exploration </w:t>
+            </w:r>
+          </w:p>
+        </w:tc>
+        <w:tc>
+          <w:tcPr>
+            <w:tcW w:w="750" w:type="dxa"/>
+            <w:vAlign w:val="center"/>
+          </w:tcPr>
+          <w:p/>
+        </w:tc>
+        <w:tc>
+          <w:tcPr>
+            <w:tcW w:w="750" w:type="dxa"/>
+            <w:vAlign w:val="center"/>
+          </w:tcPr>
+          <w:p/>
+        </w:tc>
+        <w:tc>
+          <w:tcPr>
+            <w:tcW w:w="750" w:type="dxa"/>
+            <w:shd w:val="clear" w:color="auto" w:fill="5B9BD5"/>
+            <w:vAlign w:val="center"/>
+          </w:tcPr>
+          <w:p/>
+        </w:tc>
+        <w:tc>
+          <w:tcPr>
+            <w:tcW w:w="750" w:type="dxa"/>
+            <w:vAlign w:val="center"/>
+          </w:tcPr>
+          <w:p/>
+        </w:tc>
+        <w:tc>
+          <w:tcPr>
+            <w:tcW w:w="750" w:type="dxa"/>
+            <w:vAlign w:val="center"/>
+          </w:tcPr>
+          <w:p/>
+        </w:tc>
+        <w:tc>
+          <w:tcPr>
+            <w:tcW w:w="750" w:type="dxa"/>
+            <w:vAlign w:val="center"/>
+          </w:tcPr>
+          <w:p/>
+        </w:tc>
+        <w:tc>
+          <w:tcPr>
+            <w:tcW w:w="750" w:type="dxa"/>
+            <w:vAlign w:val="center"/>
+          </w:tcPr>
+          <w:p/>
+        </w:tc>
+        <w:tc>
+          <w:tcPr>
+            <w:tcW w:w="750" w:type="dxa"/>
+            <w:vAlign w:val="center"/>
+          </w:tcPr>
+          <w:p/>
+        </w:tc>
+      </w:tr>
+      <w:tr>
+        <w:trPr>
+          <w:cantSplit/>
+          <w:jc w:val="center"/>
+        </w:trPr>
+        <w:tc>
+          <w:tcPr>
+            <w:tcW w:w="3026" w:type="dxa"/>
+            <w:vAlign w:val="center"/>
+          </w:tcPr>
+          <w:p>
+            <w:r>
+              <w:rPr>
+                <w:sz w:val="17"/>
+              </w:rPr>
+              <w:t>Data preparation</w:t>
+            </w:r>
+          </w:p>
+        </w:tc>
+        <w:tc>
+          <w:tcPr>
+            <w:tcW w:w="750" w:type="dxa"/>
+            <w:vAlign w:val="center"/>
+          </w:tcPr>
+          <w:p/>
+        </w:tc>
+        <w:tc>
+          <w:tcPr>
+            <w:tcW w:w="750" w:type="dxa"/>
+            <w:vAlign w:val="center"/>
+          </w:tcPr>
+          <w:p/>
+        </w:tc>
+        <w:tc>
+          <w:tcPr>
+            <w:tcW w:w="750" w:type="dxa"/>
+            <w:shd w:val="clear" w:color="auto" w:fill="5B9BD5"/>
+            <w:vAlign w:val="center"/>
+          </w:tcPr>
+          <w:p/>
+        </w:tc>
+        <w:tc>
+          <w:tcPr>
+            <w:tcW w:w="750" w:type="dxa"/>
+            <w:shd w:val="clear" w:color="auto" w:fill="5B9BD5"/>
+            <w:vAlign w:val="center"/>
+          </w:tcPr>
+          <w:p/>
+        </w:tc>
+        <w:tc>
+          <w:tcPr>
+            <w:tcW w:w="750" w:type="dxa"/>
+            <w:vAlign w:val="center"/>
+          </w:tcPr>
+          <w:p/>
+        </w:tc>
+        <w:tc>
+          <w:tcPr>
+            <w:tcW w:w="750" w:type="dxa"/>
+            <w:vAlign w:val="center"/>
+          </w:tcPr>
+          <w:p/>
+        </w:tc>
+        <w:tc>
+          <w:tcPr>
+            <w:tcW w:w="750" w:type="dxa"/>
+            <w:vAlign w:val="center"/>
+          </w:tcPr>
+          <w:p/>
+        </w:tc>
+        <w:tc>
+          <w:tcPr>
+            <w:tcW w:w="750" w:type="dxa"/>
+            <w:vAlign w:val="center"/>
+          </w:tcPr>
+          <w:p/>
+        </w:tc>
+      </w:tr>
+      <w:tr>
+        <w:trPr>
+          <w:cantSplit/>
+          <w:jc w:val="center"/>
+        </w:trPr>
+        <w:tc>
+          <w:tcPr>
+            <w:tcW w:w="3026" w:type="dxa"/>
+            <w:vAlign w:val="center"/>
+          </w:tcPr>
+          <w:p>
+            <w:r>
+              <w:rPr>
+                <w:sz w:val="17"/>
+              </w:rPr>
+              <w:lastRenderedPageBreak/>
+              <w:t>Statistical tests</w:t>
+            </w:r>
+          </w:p>
+        </w:tc>
+        <w:tc>
+          <w:tcPr>
+            <w:tcW w:w="750" w:type="dxa"/>
+            <w:vAlign w:val="center"/>
+          </w:tcPr>
+          <w:p/>
+        </w:tc>
+        <w:tc>
+          <w:tcPr>
+            <w:tcW w:w="750" w:type="dxa"/>
+            <w:vAlign w:val="center"/>
+          </w:tcPr>
+          <w:p/>
+        </w:tc>
+        <w:tc>
+          <w:tcPr>
+            <w:tcW w:w="750" w:type="dxa"/>
+            <w:vAlign w:val="center"/>
+          </w:tcPr>
+          <w:p/>
+        </w:tc>
+        <w:tc>
+          <w:tcPr>
+            <w:tcW w:w="750" w:type="dxa"/>
+            <w:vAlign w:val="center"/>
+          </w:tcPr>
+          <w:p/>
+        </w:tc>
+        <w:tc>
+          <w:tcPr>
+            <w:tcW w:w="750" w:type="dxa"/>
+            <w:shd w:val="clear" w:color="auto" w:fill="E97132"/>
+            <w:vAlign w:val="center"/>
+          </w:tcPr>
+          <w:p/>
+        </w:tc>
+        <w:tc>
+          <w:tcPr>
+            <w:tcW w:w="750" w:type="dxa"/>
+            <w:vAlign w:val="center"/>
+          </w:tcPr>
+          <w:p/>
+        </w:tc>
+        <w:tc>
+          <w:tcPr>
+            <w:tcW w:w="750" w:type="dxa"/>
+            <w:vAlign w:val="center"/>
+          </w:tcPr>
+          <w:p/>
+        </w:tc>
+        <w:tc>
+          <w:tcPr>
+            <w:tcW w:w="750" w:type="dxa"/>
+            <w:vAlign w:val="center"/>
+          </w:tcPr>
+          <w:p/>
+        </w:tc>
+      </w:tr>
+      <w:tr>
+        <w:trPr>
+          <w:cantSplit/>
+          <w:jc w:val="center"/>
+        </w:trPr>
+        <w:tc>
+          <w:tcPr>
+            <w:tcW w:w="3026" w:type="dxa"/>
+            <w:vAlign w:val="center"/>
+          </w:tcPr>
+          <w:p>
+            <w:r>
+              <w:rPr>
+                <w:sz w:val="17"/>
+              </w:rPr>
+              <w:t>Model training</w:t>
+            </w:r>
+          </w:p>
+        </w:tc>
+        <w:tc>
+          <w:tcPr>
+            <w:tcW w:w="750" w:type="dxa"/>
+            <w:vAlign w:val="center"/>
+          </w:tcPr>
+          <w:p/>
+        </w:tc>
+        <w:tc>
+          <w:tcPr>
+            <w:tcW w:w="750" w:type="dxa"/>
+            <w:vAlign w:val="center"/>
+          </w:tcPr>
+          <w:p/>
+        </w:tc>
+        <w:tc>
+          <w:tcPr>
+            <w:tcW w:w="750" w:type="dxa"/>
+            <w:vAlign w:val="center"/>
+          </w:tcPr>
+          <w:p/>
+        </w:tc>
+        <w:tc>
+          <w:tcPr>
+            <w:tcW w:w="750" w:type="dxa"/>
+            <w:vAlign w:val="center"/>
+          </w:tcPr>
+          <w:p/>
+        </w:tc>
+        <w:tc>
+          <w:tcPr>
+            <w:tcW w:w="750" w:type="dxa"/>
+            <w:shd w:val="clear" w:color="auto" w:fill="E97132"/>
+            <w:vAlign w:val="center"/>
+          </w:tcPr>
+          <w:p/>
+        </w:tc>
+        <w:tc>
+          <w:tcPr>
+            <w:tcW w:w="750" w:type="dxa"/>
+            <w:shd w:val="clear" w:color="auto" w:fill="E97132"/>
+            <w:vAlign w:val="center"/>
+          </w:tcPr>
+          <w:p/>
+        </w:tc>
+        <w:tc>
+          <w:tcPr>
+            <w:tcW w:w="750" w:type="dxa"/>
+            <w:vAlign w:val="center"/>
+          </w:tcPr>
+          <w:p/>
+        </w:tc>
+        <w:tc>
+          <w:tcPr>
+            <w:tcW w:w="750" w:type="dxa"/>
+            <w:vAlign w:val="center"/>
+          </w:tcPr>
+          <w:p/>
+        </w:tc>
+      </w:tr>
+      <w:tr>
+        <w:trPr>
+          <w:cantSplit/>
+          <w:jc w:val="center"/>
+        </w:trPr>
+        <w:tc>
+          <w:tcPr>
+            <w:tcW w:w="3026" w:type="dxa"/>
+            <w:vAlign w:val="center"/>
+          </w:tcPr>
+          <w:p>
+            <w:r>
+              <w:rPr>
+                <w:sz w:val="17"/>
+              </w:rPr>
+              <w:t>Clustering &amp; analysis</w:t>
+            </w:r>
+          </w:p>
+        </w:tc>
+        <w:tc>
+          <w:tcPr>
+            <w:tcW w:w="750" w:type="dxa"/>
+            <w:vAlign w:val="center"/>
+          </w:tcPr>
+          <w:p/>
+        </w:tc>
+        <w:tc>
+          <w:tcPr>
+            <w:tcW w:w="750" w:type="dxa"/>
+            <w:vAlign w:val="center"/>
+          </w:tcPr>
+          <w:p/>
+        </w:tc>
+        <w:tc>
+          <w:tcPr>
+            <w:tcW w:w="750" w:type="dxa"/>
+            <w:vAlign w:val="center"/>
+          </w:tcPr>
+          <w:p/>
+        </w:tc>
+        <w:tc>
+          <w:tcPr>
+            <w:tcW w:w="750" w:type="dxa"/>
+            <w:vAlign w:val="center"/>
+          </w:tcPr>
+          <w:p/>
+        </w:tc>
+        <w:tc>
+          <w:tcPr>
+            <w:tcW w:w="750" w:type="dxa"/>
+            <w:vAlign w:val="center"/>
+          </w:tcPr>
+          <w:p/>
+        </w:tc>
+        <w:tc>
+          <w:tcPr>
+            <w:tcW w:w="750" w:type="dxa"/>
+            <w:vAlign w:val="center"/>
+          </w:tcPr>
+          <w:p/>
+        </w:tc>
+        <w:tc>
+          <w:tcPr>
+            <w:tcW w:w="750" w:type="dxa"/>
+            <w:shd w:val="clear" w:color="auto" w:fill="E97132"/>
+            <w:vAlign w:val="center"/>
+          </w:tcPr>
+          <w:p/>
+        </w:tc>
+        <w:tc>
+          <w:tcPr>
+            <w:tcW w:w="750" w:type="dxa"/>
+            <w:vAlign w:val="center"/>
+          </w:tcPr>
+          <w:p/>
+        </w:tc>
+      </w:tr>
+      <w:tr>
+        <w:trPr>
+          <w:cantSplit/>
+          <w:jc w:val="center"/>
+        </w:trPr>
+        <w:tc>
+          <w:tcPr>
+            <w:tcW w:w="3026" w:type="dxa"/>
+            <w:vAlign w:val="center"/>
+          </w:tcPr>
+          <w:p>
+            <w:r>
+              <w:rPr>
+                <w:sz w:val="17"/>
+              </w:rPr>
+              <w:t>Evaluation</w:t>
+            </w:r>
+          </w:p>
+        </w:tc>
+        <w:tc>
+          <w:tcPr>
+            <w:tcW w:w="750" w:type="dxa"/>
+            <w:vAlign w:val="center"/>
+          </w:tcPr>
+          <w:p/>
+        </w:tc>
+        <w:tc>
+          <w:tcPr>
+            <w:tcW w:w="750" w:type="dxa"/>
+            <w:vAlign w:val="center"/>
+          </w:tcPr>
+          <w:p/>
+        </w:tc>
+        <w:tc>
+          <w:tcPr>
+            <w:tcW w:w="750" w:type="dxa"/>
+            <w:vAlign w:val="center"/>
+          </w:tcPr>
+          <w:p/>
+        </w:tc>
+        <w:tc>
+          <w:tcPr>
+            <w:tcW w:w="750" w:type="dxa"/>
+            <w:vAlign w:val="center"/>
+          </w:tcPr>
+          <w:p/>
+        </w:tc>
+        <w:tc>
+          <w:tcPr>
+            <w:tcW w:w="750" w:type="dxa"/>
+            <w:vAlign w:val="center"/>
+          </w:tcPr>
+          <w:p/>
+        </w:tc>
+        <w:tc>
+          <w:tcPr>
+            <w:tcW w:w="750" w:type="dxa"/>
+            <w:vAlign w:val="center"/>
+          </w:tcPr>
+          <w:p/>
+        </w:tc>
+        <w:tc>
+          <w:tcPr>
+            <w:tcW w:w="750" w:type="dxa"/>
+            <w:shd w:val="clear" w:color="auto" w:fill="4E9A3E"/>
+            <w:vAlign w:val="center"/>
+          </w:tcPr>
+          <w:p/>
+        </w:tc>
+        <w:tc>
+          <w:tcPr>
+            <w:tcW w:w="750" w:type="dxa"/>
+            <w:vAlign w:val="center"/>
+          </w:tcPr>
+          <w:p/>
+        </w:tc>
+      </w:tr>
+      <w:tr>
+        <w:trPr>
+          <w:cantSplit/>
+          <w:jc w:val="center"/>
+        </w:trPr>
+        <w:tc>
+          <w:tcPr>
+            <w:tcW w:w="3026" w:type="dxa"/>
+            <w:vAlign w:val="center"/>
+          </w:tcPr>
+          <w:p>
+            <w:r>
+              <w:rPr>
+                <w:sz w:val="17"/>
+              </w:rPr>
+              <w:t>Power BI dashboard</w:t>
+            </w:r>
+          </w:p>
+        </w:tc>
+        <w:tc>
+          <w:tcPr>
+            <w:tcW w:w="750" w:type="dxa"/>
+            <w:vAlign w:val="center"/>
+          </w:tcPr>
+          <w:p/>
+        </w:tc>
+        <w:tc>
+          <w:tcPr>
+            <w:tcW w:w="750" w:type="dxa"/>
+            <w:vAlign w:val="center"/>
+          </w:tcPr>
+          <w:p/>
+        </w:tc>
+        <w:tc>
+          <w:tcPr>
+            <w:tcW w:w="750" w:type="dxa"/>
+            <w:vAlign w:val="center"/>
+          </w:tcPr>
+          <w:p/>
+        </w:tc>
+        <w:tc>
+          <w:tcPr>
+            <w:tcW w:w="750" w:type="dxa"/>
+            <w:vAlign w:val="center"/>
+          </w:tcPr>
+          <w:p/>
+        </w:tc>
+        <w:tc>
+          <w:tcPr>
+            <w:tcW w:w="750" w:type="dxa"/>
+            <w:vAlign w:val="center"/>
+          </w:tcPr>
+          <w:p/>
+        </w:tc>
+        <w:tc>
+          <w:tcPr>
+            <w:tcW w:w="750" w:type="dxa"/>
+            <w:vAlign w:val="center"/>
+          </w:tcPr>
+          <w:p/>
+        </w:tc>
+        <w:tc>
+          <w:tcPr>
+            <w:tcW w:w="750" w:type="dxa"/>
+            <w:shd w:val="clear" w:color="auto" w:fill="4E9A3E"/>
+            <w:vAlign w:val="center"/>
+          </w:tcPr>
+          <w:p/>
+        </w:tc>
+        <w:tc>
+          <w:tcPr>
+            <w:tcW w:w="750" w:type="dxa"/>
+            <w:shd w:val="clear" w:color="auto" w:fill="4E9A3E"/>
+            <w:vAlign w:val="center"/>
+          </w:tcPr>
+          <w:p/>
+        </w:tc>
+      </w:tr>
+      <w:tr>
+        <w:trPr>
+          <w:cantSplit/>
+          <w:jc w:val="center"/>
+        </w:trPr>
+        <w:tc>
+          <w:tcPr>
+            <w:tcW w:w="3026" w:type="dxa"/>
+            <w:vAlign w:val="center"/>
+          </w:tcPr>
+          <w:p>
+            <w:r>
+              <w:rPr>
+                <w:sz w:val="17"/>
+              </w:rPr>
+              <w:t>Final report &amp; presentation</w:t>
+            </w:r>
+          </w:p>
+        </w:tc>
+        <w:tc>
+          <w:tcPr>
+            <w:tcW w:w="750" w:type="dxa"/>
+            <w:vAlign w:val="center"/>
+          </w:tcPr>
+          <w:p/>
+        </w:tc>
+        <w:tc>
+          <w:tcPr>
+            <w:tcW w:w="750" w:type="dxa"/>
+            <w:vAlign w:val="center"/>
+          </w:tcPr>
+          <w:p/>
+        </w:tc>
+        <w:tc>
+          <w:tcPr>
+            <w:tcW w:w="750" w:type="dxa"/>
+            <w:vAlign w:val="center"/>
+          </w:tcPr>
+          <w:p/>
+        </w:tc>
+        <w:tc>
+          <w:tcPr>
+            <w:tcW w:w="750" w:type="dxa"/>
+            <w:vAlign w:val="center"/>
+          </w:tcPr>
+          <w:p/>
+        </w:tc>
+        <w:tc>
+          <w:tcPr>
+            <w:tcW w:w="750" w:type="dxa"/>
+            <w:vAlign w:val="center"/>
+          </w:tcPr>
+          <w:p/>
+        </w:tc>
+        <w:tc>
+          <w:tcPr>
+            <w:tcW w:w="750" w:type="dxa"/>
+            <w:vAlign w:val="center"/>
+          </w:tcPr>
+          <w:p/>
+        </w:tc>
+        <w:tc>
+          <w:tcPr>
+            <w:tcW w:w="750" w:type="dxa"/>
+            <w:vAlign w:val="center"/>
+          </w:tcPr>
+          <w:p/>
+        </w:tc>
+        <w:tc>
+          <w:tcPr>
+            <w:tcW w:w="750" w:type="dxa"/>
+            <w:shd w:val="clear" w:color="auto" w:fill="4E9A3E"/>
+            <w:vAlign w:val="center"/>
+          </w:tcPr>
+          <w:p/>
+        </w:tc>
+      </w:tr>
+      <w:tr>
+        <w:trPr>
+          <w:cantSplit/>
+          <w:jc w:val="center"/>
+        </w:trPr>
+        <w:tc>
+          <w:tcPr>
+            <w:tcW w:w="3026" w:type="dxa"/>
+            <w:shd w:val="clear" w:color="auto" w:fill="F2F2F2"/>
+            <w:vAlign w:val="center"/>
+          </w:tcPr>
+          <w:p>
+            <w:r>
+              <w:rPr>
+                <w:b/>
+                <w:sz w:val="17"/>
+              </w:rPr>
+              <w:t>Milestones</w:t>
+            </w:r>
+          </w:p>
+        </w:tc>
+        <w:tc>
+          <w:tcPr>
+            <w:tcW w:w="750" w:type="dxa"/>
+            <w:shd w:val="clear" w:color="auto" w:fill="F2F2F2"/>
+            <w:vAlign w:val="center"/>
+          </w:tcPr>
+          <w:p/>
+        </w:tc>
+        <w:tc>
+          <w:tcPr>
+            <w:tcW w:w="750" w:type="dxa"/>
+            <w:shd w:val="clear" w:color="auto" w:fill="F2F2F2"/>
+            <w:vAlign w:val="center"/>
+          </w:tcPr>
+          <w:p>
+            <w:pPr>
+              <w:jc w:val="center"/>
+            </w:pPr>
+            <w:r>
+              <w:rPr>
+                <w:b/>
+                <w:sz w:val="16"/>
+              </w:rPr>
+              <w:t>◆ M1</w:t>
+            </w:r>
+          </w:p>
+        </w:tc>
+        <w:tc>
+          <w:tcPr>
+            <w:tcW w:w="750" w:type="dxa"/>
+            <w:shd w:val="clear" w:color="auto" w:fill="F2F2F2"/>
+            <w:vAlign w:val="center"/>
+          </w:tcPr>
+          <w:p/>
+        </w:tc>
+        <w:tc>
+          <w:tcPr>
+            <w:tcW w:w="750" w:type="dxa"/>
+            <w:shd w:val="clear" w:color="auto" w:fill="F2F2F2"/>
+            <w:vAlign w:val="center"/>
+          </w:tcPr>
+          <w:p>
+            <w:pPr>
+              <w:jc w:val="center"/>
+            </w:pPr>
+            <w:r>
+              <w:rPr>
+                <w:b/>
+                <w:sz w:val="16"/>
+              </w:rPr>
+              <w:t>◆ M2</w:t>
+            </w:r>
+          </w:p>
+        </w:tc>
+        <w:tc>
+          <w:tcPr>
+            <w:tcW w:w="750" w:type="dxa"/>
+            <w:shd w:val="clear" w:color="auto" w:fill="F2F2F2"/>
+            <w:vAlign w:val="center"/>
+          </w:tcPr>
+          <w:p>
+            <w:pPr>
+              <w:jc w:val="center"/>
+            </w:pPr>
+            <w:r>
+              <w:rPr>
+                <w:b/>
+                <w:sz w:val="16"/>
+              </w:rPr>
+              <w:t>◆ M3</w:t>
+            </w:r>
+          </w:p>
+        </w:tc>
+        <w:tc>
+          <w:tcPr>
+            <w:tcW w:w="750" w:type="dxa"/>
+            <w:shd w:val="clear" w:color="auto" w:fill="F2F2F2"/>
+            <w:vAlign w:val="center"/>
+          </w:tcPr>
+          <w:p/>
+        </w:tc>
+        <w:tc>
+          <w:tcPr>
+            <w:tcW w:w="750" w:type="dxa"/>
+            <w:shd w:val="clear" w:color="auto" w:fill="F2F2F2"/>
+            <w:vAlign w:val="center"/>
+          </w:tcPr>
+          <w:p>
+            <w:pPr>
+              <w:jc w:val="center"/>
+            </w:pPr>
+            <w:r>
+              <w:rPr>
+                <w:b/>
+                <w:sz w:val="16"/>
+              </w:rPr>
+              <w:t>◆ M4</w:t>
+            </w:r>
+          </w:p>
+        </w:tc>
+        <w:tc>
+          <w:tcPr>
+            <w:tcW w:w="750" w:type="dxa"/>
+            <w:shd w:val="clear" w:color="auto" w:fill="F2F2F2"/>
+            <w:vAlign w:val="center"/>
+          </w:tcPr>
+          <w:p>
+            <w:pPr>
+              <w:jc w:val="center"/>
+            </w:pPr>
+            <w:r>
+              <w:rPr>
+                <w:b/>
+                <w:sz w:val="16"/>
+              </w:rPr>
+              <w:t>◆ M5</w:t>
+            </w:r>
+          </w:p>
+        </w:tc>
+      </w:tr>
+    </w:tbl>
+    <w:p>
+      <w:pPr>
+        <w:spacing w:before="120"/>
+        <w:jc w:val="center"/>
+      </w:pPr>
+      <w:r>
+        <w:rPr>
+          <w:i/>
+          <w:color w:val="404040"/>
+          <w:sz w:val="18"/>
+        </w:rPr>
+        <w:t>Figure 2. Project Gantt chart. Dark blue = business understanding; light blue = data understanding and preparation; orange = modelling; green = evaluation and delivery; ◆ = milestone. W = teaching weeks.</w:t>
+      </w:r>
+    </w:p>
+    <w:p>
+      <w:pPr>
+        <w:pStyle w:val="Heading1"/>
+      </w:pPr>
+      <w:bookmarkStart w:id="20" w:name="_Toc242617461"/>
+      <w:r>
+        <w:t>Ethical and Legal Considerations</w:t>
+      </w:r>
+      <w:bookmarkEnd w:id="20"/>
+    </w:p>
+    <w:p>
+      <w:r>
+        <w:rPr>
+          <w:b/>
+        </w:rPr>
+        <w:t>Data protection.</w:t>
+      </w:r>
+      <w:r>
+        <w:t xml:space="preserve"> Both datasets are secondary and were anonymised by their publishers; callers, technicians and locations appear only as codes. No attempt will be made to re-identify individuals and no personal data will be collected, in line with the GDPR principle of data minimisation (European Union, 2016). No human participants are involved, consistent with the CCT ethics declaration.</w:t>
+      </w:r>
+    </w:p>
+    <w:p>
+      <w:r>
+        <w:rPr>
+          <w:b/>
+        </w:rPr>
+        <w:t>Licensing and confidentiality.</w:t>
+      </w:r>
+      <w:r>
+        <w:t xml:space="preserve"> Dataset licences will be respected and both sources cited. Although the author works in IT service reporting, no employer data, systems or figures will be used.</w:t>
+      </w:r>
+    </w:p>
+    <w:p>
+      <w:r>
+        <w:rPr>
+          <w:b/>
+        </w:rPr>
+        <w:t>Bias and fair use.</w:t>
+      </w:r>
+      <w:r>
+        <w:t xml:space="preserve"> A model may link breaches to particular support groups or locations. Results will be presented as process insights, not as measures of individual or team performance, since the EU AI Act classifies AI used to evaluate workers’ performance as high-risk (European Union, 2024). Any analytics views will be illustrative, not a compliance tool.</w:t>
+      </w:r>
+    </w:p>
+    <w:p>
+      <w:r>
+        <w:rPr>
+          <w:b/>
+          <w:bCs/>
+        </w:rPr>
+        <w:t>Data Security.</w:t>
+      </w:r>
+      <w:r>
+        <w:t xml:space="preserve"> Data and code will be stored locally and in a private GitHub repository shared only with the lecturer. No passwords, keys or confidential information will be uploaded. </w:t>
+      </w:r>
+    </w:p>
+    <w:p>
+      <w:r>
+        <w:rPr>
+          <w:b/>
+        </w:rPr>
+        <w:t>Use of AI.</w:t>
+      </w:r>
+      <w:r>
+        <w:t xml:space="preserve"> The use of generative AI in preparing this proposal is declared on the cover page and in the accompanying AI-use document.</w:t>
+      </w:r>
+    </w:p>
+    <w:p>
+      <w:r>
+        <w:br w:type="page"/>
+      </w:r>
+    </w:p>
+    <w:p>
+      <w:pPr>
+        <w:pStyle w:val="Heading1"/>
+      </w:pPr>
+      <w:bookmarkStart w:id="21" w:name="_Toc242617462"/>
+      <w:r>
+        <w:lastRenderedPageBreak/>
+        <w:t>References</w:t>
+      </w:r>
+      <w:bookmarkEnd w:id="21"/>
+    </w:p>
+    <w:p>
+      <w:pPr>
+        <w:spacing w:after="120"/>
+        <w:ind w:left="720" w:hanging="720"/>
+      </w:pPr>
+      <w:r>
+        <w:t xml:space="preserve">Amaral, C.A.L., Fantinato, M. and Peres, S.M. (2018) </w:t>
+      </w:r>
+      <w:r>
+        <w:rPr>
+          <w:i/>
+        </w:rPr>
+        <w:t>Incident management process enriched event log</w:t>
+      </w:r>
+      <w:r>
+        <w:t xml:space="preserve"> [Dataset]. UCI Machine Learning Repository. Available at: https://doi.org/10.24432/C57S4H (Accessed: 4 October 2026).</w:t>
+      </w:r>
+    </w:p>
+    <w:p>
+      <w:pPr>
+        <w:spacing w:after="120"/>
+        <w:ind w:left="720" w:hanging="720"/>
+      </w:pPr>
+      <w:r>
+        <w:t xml:space="preserve">Amaral, C.A.L., Fantinato, M., Reijers, H.A. and Peres, S.M. (2019) ‘Enhancing completion time prediction through attribute selection’, in Ziemba, E. (ed.) </w:t>
+      </w:r>
+      <w:r>
+        <w:rPr>
+          <w:i/>
+        </w:rPr>
+        <w:t>Information Technology for Management: Emerging Research and Applications</w:t>
+      </w:r>
+      <w:r>
+        <w:t>. Cham: Springer, pp. 3–23. doi: 10.1007/978-3-030-15154-6_1.</w:t>
+      </w:r>
+    </w:p>
+    <w:p>
+      <w:pPr>
+        <w:spacing w:after="120"/>
+        <w:ind w:left="720" w:hanging="720"/>
+      </w:pPr>
+      <w:r>
+        <w:t xml:space="preserve">Axelos (2019) </w:t>
+      </w:r>
+      <w:r>
+        <w:rPr>
+          <w:i/>
+        </w:rPr>
+        <w:t>ITIL Foundation: ITIL 4 Edition</w:t>
+      </w:r>
+      <w:r>
+        <w:t>. Norwich: TSO.</w:t>
+      </w:r>
+    </w:p>
+    <w:p>
+      <w:pPr>
+        <w:spacing w:after="120"/>
+        <w:ind w:left="720" w:hanging="720"/>
+      </w:pPr>
+      <w:r>
+        <w:t xml:space="preserve">Central Bank of Ireland (2021) </w:t>
+      </w:r>
+      <w:r>
+        <w:rPr>
+          <w:i/>
+        </w:rPr>
+        <w:t>Cross-Industry Guidance on Operational Resilience</w:t>
+      </w:r>
+      <w:r>
+        <w:t>. Dublin: Central Bank of Ireland. Available at: https://www.centralbank.ie/docs/default-source/publications/consultation-papers/cp140/cross-industry-guidance-on-operational-resilience.pdf (Accessed: 4 October 2026).</w:t>
+      </w:r>
+    </w:p>
+    <w:p>
+      <w:pPr>
+        <w:spacing w:after="120"/>
+        <w:ind w:left="720" w:hanging="720"/>
+      </w:pPr>
+      <w:r>
+        <w:t xml:space="preserve">Chapman, P., Clinton, J., Kerber, R., Khabaza, T., Reinartz, T., Shearer, C. and Wirth, R. (2000) </w:t>
+      </w:r>
+      <w:r>
+        <w:rPr>
+          <w:i/>
+        </w:rPr>
+        <w:t>CRISP-DM 1.0: Step-by-step data mining guide</w:t>
+      </w:r>
+      <w:r>
+        <w:t>. SPSS Inc.</w:t>
+      </w:r>
+    </w:p>
+    <w:p>
+      <w:pPr>
+        <w:spacing w:after="120"/>
+        <w:ind w:left="720" w:hanging="720"/>
+      </w:pPr>
+      <w:r>
+        <w:t xml:space="preserve">Dang, Y., Lin, Q. and Huang, P. (2019) ‘AIOps: real-world challenges and research innovations’, in </w:t>
+      </w:r>
+      <w:r>
+        <w:rPr>
+          <w:i/>
+        </w:rPr>
+        <w:t>2019 IEEE/ACM 41st International Conference on Software Engineering: Companion Proceedings (ICSE-Companion)</w:t>
+      </w:r>
+      <w:r>
+        <w:t>. Montreal: IEEE, pp. 4–5. doi: 10.1109/ICSE-Companion.2019.00023.</w:t>
+      </w:r>
+    </w:p>
+    <w:p>
+      <w:pPr>
+        <w:spacing w:after="120"/>
+        <w:ind w:left="720" w:hanging="720"/>
+      </w:pPr>
+      <w:r>
+        <w:t xml:space="preserve">European Union (2016) ‘Regulation (EU) 2016/679 of the European Parliament and of the Council of 27 April 2016 (General Data Protection Regulation)’, </w:t>
+      </w:r>
+      <w:r>
+        <w:rPr>
+          <w:i/>
+        </w:rPr>
+        <w:t>Official Journal of the European Union</w:t>
+      </w:r>
+      <w:r>
+        <w:t>, L 119, pp. 1–88.</w:t>
+      </w:r>
+    </w:p>
+    <w:p>
+      <w:pPr>
+        <w:spacing w:after="120"/>
+        <w:ind w:left="720" w:hanging="720"/>
+      </w:pPr>
+      <w:r>
+        <w:t xml:space="preserve">European Union (2022) ‘Regulation (EU) 2022/2554 of the European Parliament and of the Council of 14 December 2022 on digital operational resilience for the financial sector’, </w:t>
+      </w:r>
+      <w:r>
+        <w:rPr>
+          <w:i/>
+        </w:rPr>
+        <w:t>Official Journal of the European Union</w:t>
+      </w:r>
+      <w:r>
+        <w:t>, L 333, pp. 1–79.</w:t>
+      </w:r>
+    </w:p>
+    <w:p>
+      <w:pPr>
+        <w:spacing w:after="120"/>
+        <w:ind w:left="720" w:hanging="720"/>
+      </w:pPr>
+      <w:r>
+        <w:t xml:space="preserve">European Union (2024) ‘Regulation (EU) 2024/1689 of the European Parliament and of the Council of 13 June 2024 laying down harmonised rules on artificial intelligence (Artificial Intelligence Act)’, </w:t>
+      </w:r>
+      <w:r>
+        <w:rPr>
+          <w:i/>
+        </w:rPr>
+        <w:t>Official Journal of the European Union</w:t>
+      </w:r>
+      <w:r>
+        <w:t>, L series, 12 July.</w:t>
+      </w:r>
+    </w:p>
+    <w:p>
+      <w:pPr>
+        <w:spacing w:after="120"/>
+        <w:ind w:left="720" w:hanging="720"/>
+      </w:pPr>
+      <w:r>
+        <w:t xml:space="preserve">Kapel, E., Cruz, L., Spinellis, D. and van Deursen, A. (2024) ‘Enhancing incident management: insights from a case study at ING’, in </w:t>
+      </w:r>
+      <w:r>
+        <w:rPr>
+          <w:i/>
+        </w:rPr>
+        <w:t>Proceedings of the 1st IEEE/ACM Workshop on Software Engineering Challenges in Financial Firms (FinanSE ’24)</w:t>
+      </w:r>
+      <w:r>
+        <w:t>. Lisbon: ACM, pp. 1–8. doi: 10.1145/3643665.3648048.</w:t>
+      </w:r>
+    </w:p>
+    <w:p>
+      <w:pPr>
+        <w:spacing w:after="120"/>
+        <w:ind w:left="720" w:hanging="720"/>
+      </w:pPr>
+      <w:r>
+        <w:t xml:space="preserve">Kapel, E., Lennartz, J., Cruz, L., Spinellis, D. and van Deursen, A. (2026) ‘Learning from change: predictive models for incident prevention in a regulated IT environment’, </w:t>
+      </w:r>
+      <w:r>
+        <w:rPr>
+          <w:i/>
+        </w:rPr>
+        <w:t>arXiv preprint</w:t>
+      </w:r>
+      <w:r>
+        <w:t xml:space="preserve"> arXiv:2604.13462. Available at: https://arxiv.org/abs/2604.13462 (Accessed: 4 October 2026).</w:t>
+      </w:r>
+    </w:p>
+    <w:p>
+      <w:pPr>
+        <w:spacing w:after="120"/>
+        <w:ind w:left="720" w:hanging="720"/>
+      </w:pPr>
+      <w:r>
+        <w:t xml:space="preserve">Notaro, P., Cardoso, J. and Gerndt, M. (2021) ‘A survey of AIOps methods for failure management’, </w:t>
+      </w:r>
+      <w:r>
+        <w:rPr>
+          <w:i/>
+        </w:rPr>
+        <w:t>ACM Transactions on Intelligent Systems and Technology</w:t>
+      </w:r>
+      <w:r>
+        <w:t>, 12(6), pp. 1–45. doi: 10.1145/3483424.</w:t>
+      </w:r>
+    </w:p>
+    <w:p>
+      <w:pPr>
+        <w:spacing w:after="120"/>
+        <w:ind w:left="720" w:hanging="720"/>
+      </w:pPr>
+      <w:r>
+        <w:lastRenderedPageBreak/>
+        <w:t xml:space="preserve">Porter, M.E. and Millar, V.E. (1985) ‘How information gives you competitive advantage’, </w:t>
+      </w:r>
+      <w:r>
+        <w:rPr>
+          <w:i/>
+        </w:rPr>
+        <w:t>Harvard Business Review</w:t>
+      </w:r>
+      <w:r>
+        <w:t>, 63(4), pp. 149–160.</w:t>
+      </w:r>
+    </w:p>
+    <w:p>
+      <w:pPr>
+        <w:spacing w:after="120"/>
+        <w:ind w:left="720" w:hanging="720"/>
+      </w:pPr>
+      <w:r>
+        <w:t xml:space="preserve">van Dongen, B.F. (2014) </w:t>
+      </w:r>
+      <w:r>
+        <w:rPr>
+          <w:i/>
+        </w:rPr>
+        <w:t>BPI Challenge 2014</w:t>
+      </w:r>
+      <w:r>
+        <w:t xml:space="preserve"> [Dataset]. 4TU.ResearchData. doi: 10.4121/uuid:c3e5d162-0cfd-4bb0-bd82-af5268819c35.</w:t>
+      </w:r>
+    </w:p>
     <w:p/>
     <w:p/>
     <w:p/>
@@ -813,6 +2489,20 @@
     </w:lvl>
   </w:abstractNum>
   <w:abstractNum w:abstractNumId="1" w15:restartNumberingAfterBreak="0">
+    <w:nsid w:val="18F473A1"/>
+    <w:multiLevelType w:val="singleLevel"/>
+    <w:tmpl w:val="1809000F"/>
+    <w:lvl w:ilvl="0">
+      <w:start w:val="1"/>
+      <w:numFmt w:val="decimal"/>
+      <w:lvlText w:val="%1."/>
+      <w:lvlJc w:val="left"/>
+      <w:pPr>
+        <w:ind w:left="720" w:hanging="360"/>
+      </w:pPr>
+    </w:lvl>
+  </w:abstractNum>
+  <w:abstractNum w:abstractNumId="2" w15:restartNumberingAfterBreak="0">
     <w:nsid w:val="72E51977"/>
     <w:multiLevelType w:val="singleLevel"/>
     <w:tmpl w:val="1809000F"/>
@@ -827,13 +2517,16 @@
     </w:lvl>
   </w:abstractNum>
   <w:num w:numId="1" w16cid:durableId="116070062">
-    <w:abstractNumId w:val="1"/>
+    <w:abstractNumId w:val="2"/>
     <w:lvlOverride w:ilvl="0">
       <w:startOverride w:val="1"/>
     </w:lvlOverride>
   </w:num>
   <w:num w:numId="2" w16cid:durableId="1752652010">
     <w:abstractNumId w:val="0"/>
+  </w:num>
+  <w:num w:numId="3" w16cid:durableId="1087924587">
+    <w:abstractNumId w:val="1"/>
   </w:num>
 </w:numbering>
 </file>
@@ -1806,6 +3499,30 @@
       <w:szCs w:val="16"/>
     </w:rPr>
   </w:style>
+  <w:style w:type="table" w:styleId="TableGrid">
+    <w:name w:val="Table Grid"/>
+    <w:basedOn w:val="TableNormal"/>
+    <w:uiPriority w:val="39"/>
+    <w:rsid w:val="009167E2"/>
+    <w:pPr>
+      <w:spacing w:after="0" w:line="240" w:lineRule="auto"/>
+    </w:pPr>
+    <w:rPr>
+      <w:rFonts w:ascii="Calibri" w:eastAsia="Calibri" w:hAnsi="Calibri" w:cs="Calibri"/>
+      <w:lang w:eastAsia="en-IE"/>
+      <w14:ligatures w14:val="none"/>
+    </w:rPr>
+    <w:tblPr>
+      <w:tblBorders>
+        <w:top w:val="single" w:sz="4" w:space="0" w:color="auto"/>
+        <w:left w:val="single" w:sz="4" w:space="0" w:color="auto"/>
+        <w:bottom w:val="single" w:sz="4" w:space="0" w:color="auto"/>
+        <w:right w:val="single" w:sz="4" w:space="0" w:color="auto"/>
+        <w:insideH w:val="single" w:sz="4" w:space="0" w:color="auto"/>
+        <w:insideV w:val="single" w:sz="4" w:space="0" w:color="auto"/>
+      </w:tblBorders>
+    </w:tblPr>
+  </w:style>
 </w:styles>
 </file>
 

</xml_diff>